<commit_message>
fix(engine): T8 ledger row label follows counted; run.json restamped after a failed ledger commit (B1)
Co-Authored-By: Claude Opus 5.5 <noreply@anthropic.com>
</commit_message>
<xml_diff>
--- a/src/proofpack/templates/T8.docx
+++ b/src/proofpack/templates/T8.docx
@@ -2727,7 +2727,7 @@
               <w:pStyle w:val="PPBody"/>
             </w:pPr>
             <w:r>
-              <w:t>Acceptance runs recorded (including this run)</w:t>
+              <w:t>{% if ledger.counted %}Acceptance runs recorded (including this run){% else %}Acceptance runs recorded (stored count; this run not included){% endif %}</w:t>
             </w:r>
           </w:p>
         </w:tc>
@@ -2947,7 +2947,7 @@
               <w:pStyle w:val="PPBody"/>
             </w:pPr>
             <w:r>
-              <w:t>{% if ledger.counted %}yes (this run is included in the count above){% elif ledger.readable %}no (this run added nothing to the ledger; the count above is the stored count){% else %}no (the ledger could not be read or written; see the warning log){% endif %}</w:t>
+              <w:t>{% if ledger.counted %}yes (the count above includes this run; the ledger is written after this document, and a write that does not succeed is reported as W15 on the console, not here){% elif ledger.readable %}no (this run added nothing to the ledger; the count above is the stored count){% else %}no (the ledger could not be read or written; see the warning log){% endif %}</w:t>
             </w:r>
           </w:p>
         </w:tc>

</xml_diff>